<commit_message>
create draft de carta de referência
</commit_message>
<xml_diff>
--- a/Ussumane Momade 20260929.docx
+++ b/Ussumane Momade 20260929.docx
@@ -486,7 +486,63 @@
           <w:sz w:val="24"/>
           <w:szCs w:val="24"/>
         </w:rPr>
-        <w:t>utilização de sistemas empresariais como Costpoint na óptica de utilizador</w:t>
+        <w:t>utilização de sistemas empresariais</w:t>
+      </w:r>
+      <w:r>
+        <w:rPr>
+          <w:sz w:val="24"/>
+          <w:szCs w:val="24"/>
+        </w:rPr>
+        <w:t>,</w:t>
+      </w:r>
+      <w:r>
+        <w:rPr>
+          <w:sz w:val="24"/>
+          <w:szCs w:val="24"/>
+        </w:rPr>
+        <w:t xml:space="preserve"> </w:t>
+      </w:r>
+      <w:r>
+        <w:rPr>
+          <w:sz w:val="24"/>
+          <w:szCs w:val="24"/>
+        </w:rPr>
+        <w:t>incluindo</w:t>
+      </w:r>
+      <w:r>
+        <w:rPr>
+          <w:sz w:val="24"/>
+          <w:szCs w:val="24"/>
+        </w:rPr>
+        <w:t xml:space="preserve"> Costpoint</w:t>
+      </w:r>
+      <w:r>
+        <w:rPr>
+          <w:sz w:val="24"/>
+          <w:szCs w:val="24"/>
+        </w:rPr>
+        <w:t>,</w:t>
+      </w:r>
+      <w:r>
+        <w:rPr>
+          <w:sz w:val="24"/>
+          <w:szCs w:val="24"/>
+        </w:rPr>
+        <w:t xml:space="preserve"> na óptica d</w:t>
+      </w:r>
+      <w:r>
+        <w:rPr>
+          <w:sz w:val="24"/>
+          <w:szCs w:val="24"/>
+        </w:rPr>
+        <w:t>o</w:t>
+      </w:r>
+      <w:r>
+        <w:rPr>
+          <w:sz w:val="24"/>
+          <w:szCs w:val="24"/>
+        </w:rPr>
+        <w:t xml:space="preserve"> utilizador</w:t>
       </w:r>
       <w:r>
         <w:rPr>
@@ -2313,7 +2369,21 @@
           <w:sz w:val="24"/>
           <w:szCs w:val="24"/>
         </w:rPr>
-        <w:t xml:space="preserve">Desenvolvimento de uma mini aplicação de gestão de colaboradores, com Java + Sprint Boot, expondo uma REST API para </w:t>
+        <w:t>Desenvolvimento de uma mini aplicação de gestão de colaboradores, com Java + Sprin</w:t>
+      </w:r>
+      <w:r>
+        <w:rPr>
+          <w:sz w:val="24"/>
+          <w:szCs w:val="24"/>
+        </w:rPr>
+        <w:t>g</w:t>
+      </w:r>
+      <w:r>
+        <w:rPr>
+          <w:sz w:val="24"/>
+          <w:szCs w:val="24"/>
+        </w:rPr>
+        <w:t xml:space="preserve"> Boot, expondo uma REST API para </w:t>
       </w:r>
       <w:r>
         <w:rPr>
@@ -3044,102 +3114,66 @@
           <w:sz w:val="26"/>
           <w:szCs w:val="26"/>
         </w:rPr>
-        <w:t>OUTROS PROJETOS</w:t>
-      </w:r>
-    </w:p>
-    <w:p>
-      <w:pPr>
-        <w:pStyle w:val="ListParagraph"/>
-        <w:numPr>
-          <w:ilvl w:val="0"/>
-          <w:numId w:val="2"/>
-        </w:numPr>
-        <w:spacing w:after="40"/>
-        <w:rPr>
-          <w:sz w:val="24"/>
-          <w:szCs w:val="24"/>
-        </w:rPr>
-      </w:pPr>
+        <w:t>OUTROS PROJE</w:t>
+      </w:r>
       <w:r>
         <w:rPr>
           <w:b/>
           <w:bCs/>
-          <w:sz w:val="24"/>
-          <w:szCs w:val="24"/>
-        </w:rPr>
-        <w:t>Encurtador de links com analítica</w:t>
-      </w:r>
-      <w:r>
-        <w:rPr>
-          <w:sz w:val="24"/>
-          <w:szCs w:val="24"/>
-        </w:rPr>
-        <w:t xml:space="preserve"> (2022) – aplicação web para gestão de links encurtados por utilizador, com métricas de utilização</w:t>
-      </w:r>
-      <w:r>
-        <w:rPr>
-          <w:sz w:val="24"/>
-          <w:szCs w:val="24"/>
-        </w:rPr>
-        <w:t>.</w:t>
-      </w:r>
-      <w:r>
-        <w:rPr>
-          <w:sz w:val="24"/>
-          <w:szCs w:val="24"/>
-        </w:rPr>
-        <w:t xml:space="preserve"> </w:t>
-      </w:r>
-      <w:r>
-        <w:rPr>
-          <w:sz w:val="24"/>
-          <w:szCs w:val="24"/>
-        </w:rPr>
-        <w:t>Tecnologias: NodeJS, React,</w:t>
-      </w:r>
-      <w:r>
-        <w:rPr>
-          <w:sz w:val="24"/>
-          <w:szCs w:val="24"/>
-        </w:rPr>
-        <w:t xml:space="preserve"> JavaScript,</w:t>
-      </w:r>
-      <w:r>
-        <w:rPr>
-          <w:sz w:val="24"/>
-          <w:szCs w:val="24"/>
-        </w:rPr>
-        <w:t xml:space="preserve"> </w:t>
-      </w:r>
-      <w:r>
-        <w:rPr>
-          <w:sz w:val="24"/>
-          <w:szCs w:val="24"/>
-        </w:rPr>
-        <w:t>Redis e PostgreSQL.</w:t>
-      </w:r>
-    </w:p>
-    <w:p>
-      <w:pPr>
-        <w:pStyle w:val="ListParagraph"/>
-        <w:numPr>
-          <w:ilvl w:val="0"/>
-          <w:numId w:val="2"/>
-        </w:numPr>
-        <w:spacing w:after="40"/>
-        <w:rPr>
-          <w:sz w:val="24"/>
-          <w:szCs w:val="24"/>
-        </w:rPr>
-      </w:pPr>
+          <w:color w:val="1F3864"/>
+          <w:spacing w:val="20"/>
+          <w:sz w:val="26"/>
+          <w:szCs w:val="26"/>
+        </w:rPr>
+        <w:t>C</w:t>
+      </w:r>
       <w:r>
         <w:rPr>
           <w:b/>
           <w:bCs/>
-          <w:sz w:val="24"/>
-          <w:szCs w:val="24"/>
-        </w:rPr>
-        <w:t>Caeser Cipher</w:t>
+          <w:color w:val="1F3864"/>
+          <w:spacing w:val="20"/>
+          <w:sz w:val="26"/>
+          <w:szCs w:val="26"/>
+        </w:rPr>
+        <w:t>TOS</w:t>
+      </w:r>
+    </w:p>
+    <w:p>
+      <w:pPr>
+        <w:pStyle w:val="ListParagraph"/>
+        <w:numPr>
+          <w:ilvl w:val="0"/>
+          <w:numId w:val="2"/>
+        </w:numPr>
+        <w:spacing w:after="40"/>
+        <w:rPr>
+          <w:sz w:val="24"/>
+          <w:szCs w:val="24"/>
+        </w:rPr>
+      </w:pPr>
+      <w:r>
+        <w:rPr>
+          <w:b/>
+          <w:bCs/>
+          <w:sz w:val="24"/>
+          <w:szCs w:val="24"/>
+        </w:rPr>
+        <w:t>Encurtador de links com analítica</w:t>
+      </w:r>
+      <w:r>
+        <w:rPr>
+          <w:sz w:val="24"/>
+          <w:szCs w:val="24"/>
+        </w:rPr>
+        <w:t xml:space="preserve"> (2022) – aplicação web para gestão de links encurtados por utilizador, com métricas de utilização</w:t>
+      </w:r>
+      <w:r>
+        <w:rPr>
+          <w:sz w:val="24"/>
+          <w:szCs w:val="24"/>
+        </w:rPr>
+        <w:t>.</w:t>
       </w:r>
       <w:r>
         <w:rPr>
@@ -3153,6 +3187,82 @@
           <w:sz w:val="24"/>
           <w:szCs w:val="24"/>
         </w:rPr>
+        <w:t>Tecnologias: NodeJS, React,</w:t>
+      </w:r>
+      <w:r>
+        <w:rPr>
+          <w:sz w:val="24"/>
+          <w:szCs w:val="24"/>
+        </w:rPr>
+        <w:t xml:space="preserve"> JavaScript,</w:t>
+      </w:r>
+      <w:r>
+        <w:rPr>
+          <w:sz w:val="24"/>
+          <w:szCs w:val="24"/>
+        </w:rPr>
+        <w:t xml:space="preserve"> </w:t>
+      </w:r>
+      <w:r>
+        <w:rPr>
+          <w:sz w:val="24"/>
+          <w:szCs w:val="24"/>
+        </w:rPr>
+        <w:t>Redis e PostgreSQL.</w:t>
+      </w:r>
+    </w:p>
+    <w:p>
+      <w:pPr>
+        <w:pStyle w:val="ListParagraph"/>
+        <w:numPr>
+          <w:ilvl w:val="0"/>
+          <w:numId w:val="2"/>
+        </w:numPr>
+        <w:spacing w:after="40"/>
+        <w:rPr>
+          <w:sz w:val="24"/>
+          <w:szCs w:val="24"/>
+        </w:rPr>
+      </w:pPr>
+      <w:r>
+        <w:rPr>
+          <w:b/>
+          <w:bCs/>
+          <w:sz w:val="24"/>
+          <w:szCs w:val="24"/>
+        </w:rPr>
+        <w:t>Caes</w:t>
+      </w:r>
+      <w:r>
+        <w:rPr>
+          <w:b/>
+          <w:bCs/>
+          <w:sz w:val="24"/>
+          <w:szCs w:val="24"/>
+        </w:rPr>
+        <w:t>a</w:t>
+      </w:r>
+      <w:r>
+        <w:rPr>
+          <w:b/>
+          <w:bCs/>
+          <w:sz w:val="24"/>
+          <w:szCs w:val="24"/>
+        </w:rPr>
+        <w:t>r Cipher</w:t>
+      </w:r>
+      <w:r>
+        <w:rPr>
+          <w:sz w:val="24"/>
+          <w:szCs w:val="24"/>
+        </w:rPr>
+        <w:t xml:space="preserve"> </w:t>
+      </w:r>
+      <w:r>
+        <w:rPr>
+          <w:sz w:val="24"/>
+          <w:szCs w:val="24"/>
+        </w:rPr>
         <w:t>(2022)</w:t>
       </w:r>
       <w:r>
@@ -3167,7 +3277,21 @@
           <w:sz w:val="24"/>
           <w:szCs w:val="24"/>
         </w:rPr>
-        <w:t>– desenvolvimento de uma aplicação Java para cifragem e decifragem de mensagens utilizando o algoritmo Caeser Cipher, com deslocamento configurado em n=3.</w:t>
+        <w:t>– desenvolvimento de uma aplicação Java para cifragem e decifragem de mensagens utilizando o algoritmo Caes</w:t>
+      </w:r>
+      <w:r>
+        <w:rPr>
+          <w:sz w:val="24"/>
+          <w:szCs w:val="24"/>
+        </w:rPr>
+        <w:t>a</w:t>
+      </w:r>
+      <w:r>
+        <w:rPr>
+          <w:sz w:val="24"/>
+          <w:szCs w:val="24"/>
+        </w:rPr>
+        <w:t>r Cipher, com deslocamento configurado em n=3.</w:t>
       </w:r>
     </w:p>
     <w:p>

</xml_diff>